<commit_message>
SE CREAN ARCHIVOS DE PRUEBA Y ARCHIVO DE EJECUCION DE PROGRAMAS
</commit_message>
<xml_diff>
--- a/Conclusiones.docx
+++ b/Conclusiones.docx
@@ -1,6 +1,6 @@
 
 <file path=word/document.xml><?xml version="1.0" encoding="utf-8"?>
-<w:document xmlns:wpc="http://schemas.microsoft.com/office/word/2010/wordprocessingCanvas" xmlns:cx="http://schemas.microsoft.com/office/drawing/2014/chartex" xmlns:cx1="http://schemas.microsoft.com/office/drawing/2015/9/8/chartex" xmlns:cx2="http://schemas.microsoft.com/office/drawing/2015/10/21/chartex" xmlns:cx3="http://schemas.microsoft.com/office/drawing/2016/5/9/chartex" xmlns:cx4="http://schemas.microsoft.com/office/drawing/2016/5/10/chartex" xmlns:cx5="http://schemas.microsoft.com/office/drawing/2016/5/11/chartex" xmlns:cx6="http://schemas.microsoft.com/office/drawing/2016/5/12/chartex" xmlns:cx7="http://schemas.microsoft.com/office/drawing/2016/5/13/chartex" xmlns:cx8="http://schemas.microsoft.com/office/drawing/2016/5/14/chartex" xmlns:mc="http://schemas.openxmlformats.org/markup-compatibility/2006" xmlns:aink="http://schemas.microsoft.com/office/drawing/2016/ink" xmlns:am3d="http://schemas.microsoft.com/office/drawing/2017/model3d" xmlns:o="urn:schemas-microsoft-com:office:office" xmlns:oel="http://schemas.microsoft.com/office/2019/extlst" xmlns:r="http://schemas.openxmlformats.org/officeDocument/2006/relationships" xmlns:m="http://schemas.openxmlformats.org/officeDocument/2006/math" xmlns:v="urn:schemas-microsoft-com:vml" xmlns:wp14="http://schemas.microsoft.com/office/word/2010/wordprocessingDrawing" xmlns:wp="http://schemas.openxmlformats.org/drawingml/2006/wordprocessingDrawing" xmlns:w10="urn:schemas-microsoft-com:office:word" xmlns:w="http://schemas.openxmlformats.org/wordprocessingml/2006/main" xmlns:w14="http://schemas.microsoft.com/office/word/2010/wordml" xmlns:w15="http://schemas.microsoft.com/office/word/2012/wordml" xmlns:w16cex="http://schemas.microsoft.com/office/word/2018/wordml/cex" xmlns:w16cid="http://schemas.microsoft.com/office/word/2016/wordml/cid" xmlns:w16="http://schemas.microsoft.com/office/word/2018/wordml" xmlns:w16du="http://schemas.microsoft.com/office/word/2023/wordml/word16du" xmlns:w16sdtdh="http://schemas.microsoft.com/office/word/2020/wordml/sdtdatahash" xmlns:w16sdtfl="http://schemas.microsoft.com/office/word/2024/wordml/sdtformatlock" xmlns:w16se="http://schemas.microsoft.com/office/word/2015/wordml/symex" xmlns:wpg="http://schemas.microsoft.com/office/word/2010/wordprocessingGroup" xmlns:wpi="http://schemas.microsoft.com/office/word/2010/wordprocessingInk" xmlns:wne="http://schemas.microsoft.com/office/word/2006/wordml" xmlns:wps="http://schemas.microsoft.com/office/word/2010/wordprocessingShape" mc:Ignorable="w14 w15 w16se w16cid w16 w16cex w16sdtdh w16sdtfl w16du wp14">
+<w:document xmlns:wpc="http://schemas.microsoft.com/office/word/2010/wordprocessingCanvas" xmlns:cx="http://schemas.microsoft.com/office/drawing/2014/chartex" xmlns:cx1="http://schemas.microsoft.com/office/drawing/2015/9/8/chartex" xmlns:cx2="http://schemas.microsoft.com/office/drawing/2015/10/21/chartex" xmlns:cx3="http://schemas.microsoft.com/office/drawing/2016/5/9/chartex" xmlns:cx4="http://schemas.microsoft.com/office/drawing/2016/5/10/chartex" xmlns:cx5="http://schemas.microsoft.com/office/drawing/2016/5/11/chartex" xmlns:cx6="http://schemas.microsoft.com/office/drawing/2016/5/12/chartex" xmlns:cx7="http://schemas.microsoft.com/office/drawing/2016/5/13/chartex" xmlns:cx8="http://schemas.microsoft.com/office/drawing/2016/5/14/chartex" xmlns:mc="http://schemas.openxmlformats.org/markup-compatibility/2006" xmlns:aink="http://schemas.microsoft.com/office/drawing/2016/ink" xmlns:am3d="http://schemas.microsoft.com/office/drawing/2017/model3d" xmlns:o="urn:schemas-microsoft-com:office:office" xmlns:oel="http://schemas.microsoft.com/office/2019/extlst" xmlns:r="http://schemas.openxmlformats.org/officeDocument/2006/relationships" xmlns:m="http://schemas.openxmlformats.org/officeDocument/2006/math" xmlns:v="urn:schemas-microsoft-com:vml" xmlns:wp14="http://schemas.microsoft.com/office/word/2010/wordprocessingDrawing" xmlns:wp="http://schemas.openxmlformats.org/drawingml/2006/wordprocessingDrawing" xmlns:w10="urn:schemas-microsoft-com:office:word" xmlns:w="http://schemas.openxmlformats.org/wordprocessingml/2006/main" xmlns:w14="http://schemas.microsoft.com/office/word/2010/wordml" xmlns:w15="http://schemas.microsoft.com/office/word/2012/wordml" xmlns:w16cex="http://schemas.microsoft.com/office/word/2018/wordml/cex" xmlns:w16cid="http://schemas.microsoft.com/office/word/2016/wordml/cid" xmlns:w16="http://schemas.microsoft.com/office/word/2018/wordml" xmlns:w16sdtdh="http://schemas.microsoft.com/office/word/2020/wordml/sdtdatahash" xmlns:w16se="http://schemas.microsoft.com/office/word/2015/wordml/symex" xmlns:wpg="http://schemas.microsoft.com/office/word/2010/wordprocessingGroup" xmlns:wpi="http://schemas.microsoft.com/office/word/2010/wordprocessingInk" xmlns:wne="http://schemas.microsoft.com/office/word/2006/wordml" xmlns:wps="http://schemas.microsoft.com/office/word/2010/wordprocessingShape" mc:Ignorable="w14 w15 w16se w16cid w16 w16cex w16sdtdh wp14">
   <w:body>
     <w:p>
       <w:pPr>
@@ -434,7 +434,42 @@
           <w:lang w:val="es-ES"/>
         </w:rPr>
         <w:tab/>
-        <w:t>A medida que se fueron realizando pruebas para ver su funcionamiento me fui encontrando con muchos errores del tipo semántico que no estaban capturados para lo cual se le fueron agregando todas las salidas de error que se fueron encontrando.</w:t>
+      </w:r>
+      <w:r>
+        <w:rPr>
+          <w:lang w:val="es-ES"/>
+        </w:rPr>
+        <w:t xml:space="preserve">Mientras </w:t>
+      </w:r>
+      <w:r>
+        <w:rPr>
+          <w:lang w:val="es-ES"/>
+        </w:rPr>
+        <w:t>se fueron realizando pruebas para ver su funcionamiento me fui encontrando con muchos errores del tipo semántico que no estaban capturados</w:t>
+      </w:r>
+      <w:r>
+        <w:rPr>
+          <w:lang w:val="es-ES"/>
+        </w:rPr>
+        <w:t>,</w:t>
+      </w:r>
+      <w:r>
+        <w:rPr>
+          <w:lang w:val="es-ES"/>
+        </w:rPr>
+        <w:t xml:space="preserve"> para lo cual se le fueron agregando todas las salidas</w:t>
+      </w:r>
+      <w:r>
+        <w:rPr>
+          <w:lang w:val="es-ES"/>
+        </w:rPr>
+        <w:t xml:space="preserve"> (mensajes)</w:t>
+      </w:r>
+      <w:r>
+        <w:rPr>
+          <w:lang w:val="es-ES"/>
+        </w:rPr>
+        <w:t xml:space="preserve"> de error que se fueron encontrando.</w:t>
       </w:r>
     </w:p>
     <w:p>
@@ -479,17 +514,9 @@
       </w:pPr>
       <w:r>
         <w:rPr>
-          <w:i/>
-          <w:iCs/>
-          <w:lang w:val="es-ES"/>
-        </w:rPr>
-        <w:t>Apreciación final</w:t>
-      </w:r>
-      <w:r>
-        <w:rPr>
-          <w:lang w:val="es-ES"/>
-        </w:rPr>
-        <w:t>:</w:t>
+          <w:lang w:val="es-ES"/>
+        </w:rPr>
+        <w:t>Futuras implementaciones:</w:t>
       </w:r>
     </w:p>
     <w:p>
@@ -503,6 +530,44 @@
         <w:rPr>
           <w:lang w:val="es-ES"/>
         </w:rPr>
+        <w:tab/>
+        <w:t xml:space="preserve">Siento que, por lo que uno va aprendiendo sobre la marcha y a raíz de ir construyendo el lenguaje y entendiendo por donde va, le faltan muchas otras cosas que le agregaría como, repeticiones, simples o condicionales, que me permitan realizar n veces las concatenaciones necesarias, agregarle parámetros a las funciones que me permitirían reducir muchísimo el código para la creación de las estructuras, y seguramente muchas otras cosas que a medida que uno va utilizando (probando) el lenguaje se va dando cuenta de las herramientas que le hacen falta. </w:t>
+      </w:r>
+    </w:p>
+    <w:p>
+      <w:pPr>
+        <w:jc w:val="both"/>
+        <w:rPr>
+          <w:lang w:val="es-ES"/>
+        </w:rPr>
+      </w:pPr>
+      <w:r>
+        <w:rPr>
+          <w:i/>
+          <w:iCs/>
+          <w:lang w:val="es-ES"/>
+        </w:rPr>
+        <w:t>Apreciación final</w:t>
+      </w:r>
+      <w:r>
+        <w:rPr>
+          <w:lang w:val="es-ES"/>
+        </w:rPr>
+        <w:t>:</w:t>
+      </w:r>
+    </w:p>
+    <w:p>
+      <w:pPr>
+        <w:jc w:val="both"/>
+        <w:rPr>
+          <w:lang w:val="es-ES"/>
+        </w:rPr>
+      </w:pPr>
+      <w:r>
+        <w:rPr>
+          <w:lang w:val="es-ES"/>
+        </w:rPr>
+        <w:lastRenderedPageBreak/>
         <w:tab/>
         <w:t>Me gust</w:t>
       </w:r>
@@ -590,7 +655,7 @@
 </file>
 
 <file path=word/styles.xml><?xml version="1.0" encoding="utf-8"?>
-<w:styles xmlns:mc="http://schemas.openxmlformats.org/markup-compatibility/2006" xmlns:r="http://schemas.openxmlformats.org/officeDocument/2006/relationships" xmlns:w="http://schemas.openxmlformats.org/wordprocessingml/2006/main" xmlns:w14="http://schemas.microsoft.com/office/word/2010/wordml" xmlns:w15="http://schemas.microsoft.com/office/word/2012/wordml" xmlns:w16cex="http://schemas.microsoft.com/office/word/2018/wordml/cex" xmlns:w16cid="http://schemas.microsoft.com/office/word/2016/wordml/cid" xmlns:w16="http://schemas.microsoft.com/office/word/2018/wordml" xmlns:w16du="http://schemas.microsoft.com/office/word/2023/wordml/word16du" xmlns:w16sdtdh="http://schemas.microsoft.com/office/word/2020/wordml/sdtdatahash" xmlns:w16sdtfl="http://schemas.microsoft.com/office/word/2024/wordml/sdtformatlock" xmlns:w16se="http://schemas.microsoft.com/office/word/2015/wordml/symex" mc:Ignorable="w14 w15 w16se w16cid w16 w16cex w16sdtdh w16sdtfl w16du">
+<w:styles xmlns:mc="http://schemas.openxmlformats.org/markup-compatibility/2006" xmlns:r="http://schemas.openxmlformats.org/officeDocument/2006/relationships" xmlns:w="http://schemas.openxmlformats.org/wordprocessingml/2006/main" xmlns:w14="http://schemas.microsoft.com/office/word/2010/wordml" xmlns:w15="http://schemas.microsoft.com/office/word/2012/wordml" xmlns:w16cex="http://schemas.microsoft.com/office/word/2018/wordml/cex" xmlns:w16cid="http://schemas.microsoft.com/office/word/2016/wordml/cid" xmlns:w16="http://schemas.microsoft.com/office/word/2018/wordml" xmlns:w16sdtdh="http://schemas.microsoft.com/office/word/2020/wordml/sdtdatahash" xmlns:w16se="http://schemas.microsoft.com/office/word/2015/wordml/symex" mc:Ignorable="w14 w15 w16se w16cid w16 w16cex w16sdtdh">
   <w:docDefaults>
     <w:rPrDefault>
       <w:rPr>

</xml_diff>